<commit_message>
POO S15-S16: profundizacion rigurosa (proyecto final, sustentacion, sintesis integradora, cierre)
Co-Authored-By: Claude Opus 4.8 <noreply@anthropic.com>
</commit_message>
<xml_diff>
--- a/15-week/optional-activity/pdf/Actividad-Semana15.docx
+++ b/15-week/optional-activity/pdf/Actividad-Semana15.docx
@@ -430,7 +430,7 @@
           <w:sz w:val="22"/>
           <w:szCs w:val="22"/>
         </w:rPr>
-        <w:t xml:space="preserve">Integrar los pilares de POO en un sistema funcional.</w:t>
+        <w:t xml:space="preserve">Integrar los pilares de POO en un sistema completo.</w:t>
       </w:r>
     </w:p>
     <w:p>
@@ -454,7 +454,7 @@
           <w:sz w:val="22"/>
           <w:szCs w:val="22"/>
         </w:rPr>
-        <w:t xml:space="preserve">Incluir colecciones, excepciones y persistencia.</w:t>
+        <w:t xml:space="preserve">Entregar el proyecto con estructura y documentación profesionales.</w:t>
       </w:r>
     </w:p>
     <w:p>
@@ -478,7 +478,7 @@
           <w:sz w:val="22"/>
           <w:szCs w:val="22"/>
         </w:rPr>
-        <w:t xml:space="preserve">Entregar de forma incremental por GitHub.</w:t>
+        <w:t xml:space="preserve">Autoevaluar el trabajo con la rúbrica antes de compartirlo.</w:t>
       </w:r>
     </w:p>
     <w:p>
@@ -512,7 +512,45 @@
           <w:sz w:val="22"/>
           <w:szCs w:val="22"/>
         </w:rPr>
-        <w:t xml:space="preserve">Desarrolla y entrega tu proyecto final cumpliendo los requisitos mínimos:</w:t>
+        <w:t xml:space="preserve">Construye una </w:t>
+      </w:r>
+      <w:r>
+        <w:rPr>
+          <w:rFonts w:ascii="Times New Roman" w:hAnsi="Times New Roman" w:cs="Times New Roman"/>
+          <w:b/>
+          <w:color w:val="000000"/>
+          <w:sz w:val="22"/>
+          <w:szCs w:val="22"/>
+        </w:rPr>
+        <w:t xml:space="preserve">aplicación de consola en Java</w:t>
+      </w:r>
+      <w:r>
+        <w:rPr>
+          <w:rFonts w:ascii="Times New Roman" w:hAnsi="Times New Roman" w:cs="Times New Roman"/>
+          <w:color w:val="000000"/>
+          <w:sz w:val="22"/>
+          <w:szCs w:val="22"/>
+        </w:rPr>
+        <w:t xml:space="preserve"> para un problema de gestión (biblioteca, inventario, agenda, estudiantes, playlist…) que integre </w:t>
+      </w:r>
+      <w:r>
+        <w:rPr>
+          <w:rFonts w:ascii="Times New Roman" w:hAnsi="Times New Roman" w:cs="Times New Roman"/>
+          <w:b/>
+          <w:color w:val="000000"/>
+          <w:sz w:val="22"/>
+          <w:szCs w:val="22"/>
+        </w:rPr>
+        <w:t xml:space="preserve">todo el curso</w:t>
+      </w:r>
+      <w:r>
+        <w:rPr>
+          <w:rFonts w:ascii="Times New Roman" w:hAnsi="Times New Roman" w:cs="Times New Roman"/>
+          <w:color w:val="000000"/>
+          <w:sz w:val="22"/>
+          <w:szCs w:val="22"/>
+        </w:rPr>
+        <w:t xml:space="preserve">:</w:t>
       </w:r>
     </w:p>
     <w:p>
@@ -532,30 +570,59 @@
       <w:r>
         <w:rPr>
           <w:rFonts w:ascii="Times New Roman" w:hAnsi="Times New Roman" w:cs="Times New Roman"/>
-          <w:color w:val="000000"/>
-          <w:sz w:val="22"/>
-          <w:szCs w:val="22"/>
-        </w:rPr>
-        <w:t xml:space="preserve">Modelo con </w:t>
-      </w:r>
-      <w:r>
-        <w:rPr>
-          <w:rFonts w:ascii="Times New Roman" w:hAnsi="Times New Roman" w:cs="Times New Roman"/>
           <w:b/>
           <w:color w:val="000000"/>
           <w:sz w:val="22"/>
           <w:szCs w:val="22"/>
         </w:rPr>
-        <w:t xml:space="preserve">encapsulamiento</w:t>
-      </w:r>
-      <w:r>
-        <w:rPr>
-          <w:rFonts w:ascii="Times New Roman" w:hAnsi="Times New Roman" w:cs="Times New Roman"/>
-          <w:color w:val="000000"/>
-          <w:sz w:val="22"/>
-          <w:szCs w:val="22"/>
-        </w:rPr>
-        <w:t xml:space="preserve"> y validación.</w:t>
+        <w:t xml:space="preserve">Modelo</w:t>
+      </w:r>
+      <w:r>
+        <w:rPr>
+          <w:rFonts w:ascii="Times New Roman" w:hAnsi="Times New Roman" w:cs="Times New Roman"/>
+          <w:color w:val="000000"/>
+          <w:sz w:val="22"/>
+          <w:szCs w:val="22"/>
+        </w:rPr>
+        <w:t xml:space="preserve"> encapsulado con invariantes; usa </w:t>
+      </w:r>
+      <w:r>
+        <w:rPr>
+          <w:rFonts w:ascii="Times New Roman" w:hAnsi="Times New Roman" w:cs="Times New Roman"/>
+          <w:b/>
+          <w:color w:val="000000"/>
+          <w:sz w:val="22"/>
+          <w:szCs w:val="22"/>
+        </w:rPr>
+        <w:t xml:space="preserve">herencia/interfaces + polimorfismo</w:t>
+      </w:r>
+      <w:r>
+        <w:rPr>
+          <w:rFonts w:ascii="Times New Roman" w:hAnsi="Times New Roman" w:cs="Times New Roman"/>
+          <w:color w:val="000000"/>
+          <w:sz w:val="22"/>
+          <w:szCs w:val="22"/>
+        </w:rPr>
+        <w:t xml:space="preserve"> y </w:t>
+      </w:r>
+      <w:r>
+        <w:rPr>
+          <w:rFonts w:ascii="Times New Roman" w:hAnsi="Times New Roman" w:cs="Times New Roman"/>
+          <w:b/>
+          <w:color w:val="000000"/>
+          <w:sz w:val="22"/>
+          <w:szCs w:val="22"/>
+        </w:rPr>
+        <w:t xml:space="preserve">composición</w:t>
+      </w:r>
+      <w:r>
+        <w:rPr>
+          <w:rFonts w:ascii="Times New Roman" w:hAnsi="Times New Roman" w:cs="Times New Roman"/>
+          <w:color w:val="000000"/>
+          <w:sz w:val="22"/>
+          <w:szCs w:val="22"/>
+        </w:rPr>
+        <w:t xml:space="preserve">.</w:t>
       </w:r>
     </w:p>
     <w:p>
@@ -580,16 +647,52 @@
           <w:sz w:val="22"/>
           <w:szCs w:val="22"/>
         </w:rPr>
-        <w:t xml:space="preserve">Herencia o interfaces + polimorfismo</w:t>
-      </w:r>
-      <w:r>
-        <w:rPr>
-          <w:rFonts w:ascii="Times New Roman" w:hAnsi="Times New Roman" w:cs="Times New Roman"/>
-          <w:color w:val="000000"/>
-          <w:sz w:val="22"/>
-          <w:szCs w:val="22"/>
-        </w:rPr>
-        <w:t xml:space="preserve">.</w:t>
+        <w:t xml:space="preserve">Colecciones</w:t>
+      </w:r>
+      <w:r>
+        <w:rPr>
+          <w:rFonts w:ascii="Times New Roman" w:hAnsi="Times New Roman" w:cs="Times New Roman"/>
+          <w:color w:val="000000"/>
+          <w:sz w:val="22"/>
+          <w:szCs w:val="22"/>
+        </w:rPr>
+        <w:t xml:space="preserve"> (</w:t>
+      </w:r>
+      <w:r>
+        <w:rPr>
+          <w:rFonts w:ascii="Consolas" w:hAnsi="Consolas" w:cs="Consolas"/>
+          <w:color w:val="000000"/>
+          <w:sz w:val="22"/>
+          <w:szCs w:val="22"/>
+        </w:rPr>
+        <w:t xml:space="preserve">List</w:t>
+      </w:r>
+      <w:r>
+        <w:rPr>
+          <w:rFonts w:ascii="Times New Roman" w:hAnsi="Times New Roman" w:cs="Times New Roman"/>
+          <w:color w:val="000000"/>
+          <w:sz w:val="22"/>
+          <w:szCs w:val="22"/>
+        </w:rPr>
+        <w:t xml:space="preserve">/</w:t>
+      </w:r>
+      <w:r>
+        <w:rPr>
+          <w:rFonts w:ascii="Consolas" w:hAnsi="Consolas" w:cs="Consolas"/>
+          <w:color w:val="000000"/>
+          <w:sz w:val="22"/>
+          <w:szCs w:val="22"/>
+        </w:rPr>
+        <w:t xml:space="preserve">Map</w:t>
+      </w:r>
+      <w:r>
+        <w:rPr>
+          <w:rFonts w:ascii="Times New Roman" w:hAnsi="Times New Roman" w:cs="Times New Roman"/>
+          <w:color w:val="000000"/>
+          <w:sz w:val="22"/>
+          <w:szCs w:val="22"/>
+        </w:rPr>
+        <w:t xml:space="preserve">) para gestionar los datos.</w:t>
       </w:r>
     </w:p>
     <w:p>
@@ -614,16 +717,16 @@
           <w:sz w:val="22"/>
           <w:szCs w:val="22"/>
         </w:rPr>
-        <w:t xml:space="preserve">Composición</w:t>
-      </w:r>
-      <w:r>
-        <w:rPr>
-          <w:rFonts w:ascii="Times New Roman" w:hAnsi="Times New Roman" w:cs="Times New Roman"/>
-          <w:color w:val="000000"/>
-          <w:sz w:val="22"/>
-          <w:szCs w:val="22"/>
-        </w:rPr>
-        <w:t xml:space="preserve"> donde aplique.</w:t>
+        <w:t xml:space="preserve">CRUD</w:t>
+      </w:r>
+      <w:r>
+        <w:rPr>
+          <w:rFonts w:ascii="Times New Roman" w:hAnsi="Times New Roman" w:cs="Times New Roman"/>
+          <w:color w:val="000000"/>
+          <w:sz w:val="22"/>
+          <w:szCs w:val="22"/>
+        </w:rPr>
+        <w:t xml:space="preserve"> completo sobre la entidad principal.</w:t>
       </w:r>
     </w:p>
     <w:p>
@@ -648,16 +751,35 @@
           <w:sz w:val="22"/>
           <w:szCs w:val="22"/>
         </w:rPr>
-        <w:t xml:space="preserve">Colecciones</w:t>
-      </w:r>
-      <w:r>
-        <w:rPr>
-          <w:rFonts w:ascii="Times New Roman" w:hAnsi="Times New Roman" w:cs="Times New Roman"/>
-          <w:color w:val="000000"/>
-          <w:sz w:val="22"/>
-          <w:szCs w:val="22"/>
-        </w:rPr>
-        <w:t xml:space="preserve"> (List/Map) para gestionar datos.</w:t>
+        <w:t xml:space="preserve">Excepciones</w:t>
+      </w:r>
+      <w:r>
+        <w:rPr>
+          <w:rFonts w:ascii="Times New Roman" w:hAnsi="Times New Roman" w:cs="Times New Roman"/>
+          <w:color w:val="000000"/>
+          <w:sz w:val="22"/>
+          <w:szCs w:val="22"/>
+        </w:rPr>
+        <w:t xml:space="preserve"> (validación y errores controlados; al menos una </w:t>
+      </w:r>
+      <w:r>
+        <w:rPr>
+          <w:rFonts w:ascii="Times New Roman" w:hAnsi="Times New Roman" w:cs="Times New Roman"/>
+          <w:b/>
+          <w:color w:val="000000"/>
+          <w:sz w:val="22"/>
+          <w:szCs w:val="22"/>
+        </w:rPr>
+        <w:t xml:space="preserve">propia</w:t>
+      </w:r>
+      <w:r>
+        <w:rPr>
+          <w:rFonts w:ascii="Times New Roman" w:hAnsi="Times New Roman" w:cs="Times New Roman"/>
+          <w:color w:val="000000"/>
+          <w:sz w:val="22"/>
+          <w:szCs w:val="22"/>
+        </w:rPr>
+        <w:t xml:space="preserve">).</w:t>
       </w:r>
     </w:p>
     <w:p>
@@ -682,16 +804,16 @@
           <w:sz w:val="22"/>
           <w:szCs w:val="22"/>
         </w:rPr>
-        <w:t xml:space="preserve">Excepciones</w:t>
-      </w:r>
-      <w:r>
-        <w:rPr>
-          <w:rFonts w:ascii="Times New Roman" w:hAnsi="Times New Roman" w:cs="Times New Roman"/>
-          <w:color w:val="000000"/>
-          <w:sz w:val="22"/>
-          <w:szCs w:val="22"/>
-        </w:rPr>
-        <w:t xml:space="preserve"> y </w:t>
+        <w:t xml:space="preserve">Persistencia</w:t>
+      </w:r>
+      <w:r>
+        <w:rPr>
+          <w:rFonts w:ascii="Times New Roman" w:hAnsi="Times New Roman" w:cs="Times New Roman"/>
+          <w:color w:val="000000"/>
+          <w:sz w:val="22"/>
+          <w:szCs w:val="22"/>
+        </w:rPr>
+        <w:t xml:space="preserve"> en archivo, aislada en un </w:t>
       </w:r>
       <w:r>
         <w:rPr>
@@ -701,16 +823,16 @@
           <w:sz w:val="22"/>
           <w:szCs w:val="22"/>
         </w:rPr>
-        <w:t xml:space="preserve">persistencia</w:t>
-      </w:r>
-      <w:r>
-        <w:rPr>
-          <w:rFonts w:ascii="Times New Roman" w:hAnsi="Times New Roman" w:cs="Times New Roman"/>
-          <w:color w:val="000000"/>
-          <w:sz w:val="22"/>
-          <w:szCs w:val="22"/>
-        </w:rPr>
-        <w:t xml:space="preserve"> en archivo.</w:t>
+        <w:t xml:space="preserve">repositorio</w:t>
+      </w:r>
+      <w:r>
+        <w:rPr>
+          <w:rFonts w:ascii="Times New Roman" w:hAnsi="Times New Roman" w:cs="Times New Roman"/>
+          <w:color w:val="000000"/>
+          <w:sz w:val="22"/>
+          <w:szCs w:val="22"/>
+        </w:rPr>
+        <w:t xml:space="preserve">.</w:t>
       </w:r>
     </w:p>
     <w:p>
@@ -735,16 +857,16 @@
           <w:sz w:val="22"/>
           <w:szCs w:val="22"/>
         </w:rPr>
-        <w:t xml:space="preserve">CRUD</w:t>
-      </w:r>
-      <w:r>
-        <w:rPr>
-          <w:rFonts w:ascii="Times New Roman" w:hAnsi="Times New Roman" w:cs="Times New Roman"/>
-          <w:color w:val="000000"/>
-          <w:sz w:val="22"/>
-          <w:szCs w:val="22"/>
-        </w:rPr>
-        <w:t xml:space="preserve"> completo sobre la entidad principal.</w:t>
+        <w:t xml:space="preserve">Buenas prácticas</w:t>
+      </w:r>
+      <w:r>
+        <w:rPr>
+          <w:rFonts w:ascii="Times New Roman" w:hAnsi="Times New Roman" w:cs="Times New Roman"/>
+          <w:color w:val="000000"/>
+          <w:sz w:val="22"/>
+          <w:szCs w:val="22"/>
+        </w:rPr>
+        <w:t xml:space="preserve">: nombres claros, DRY, métodos cortos, sin números mágicos.</w:t>
       </w:r>
     </w:p>
     <w:p>
@@ -787,7 +909,7 @@
           <w:sz w:val="22"/>
           <w:szCs w:val="22"/>
         </w:rPr>
-        <w:t xml:space="preserve">Todos los puntos del enunciado, integrados.</w:t>
+        <w:t xml:space="preserve">Todos los pilares de POO aplicados y justificados.</w:t>
       </w:r>
     </w:p>
     <w:p>
@@ -811,7 +933,7 @@
           <w:sz w:val="22"/>
           <w:szCs w:val="22"/>
         </w:rPr>
-        <w:t xml:space="preserve">README con diseño (clases y relaciones), instrucciones y capturas.</w:t>
+        <w:t xml:space="preserve">Colecciones + excepciones + persistencia + CRUD funcionando.</w:t>
       </w:r>
     </w:p>
     <w:p>
@@ -835,7 +957,31 @@
           <w:sz w:val="22"/>
           <w:szCs w:val="22"/>
         </w:rPr>
-        <w:t xml:space="preserve">Historial de commits incremental.</w:t>
+        <w:t xml:space="preserve">Diseño por capas (modelo / servicio / persistencia / app).</w:t>
+      </w:r>
+    </w:p>
+    <w:p>
+      <w:pPr>
+        <w:spacing w:after="120" w:line="276" w:lineRule="auto"/>
+        <w:ind w:left="454" w:hanging="284"/>
+      </w:pPr>
+      <w:r>
+        <w:rPr>
+          <w:rFonts w:ascii="Times New Roman" w:hAnsi="Times New Roman" w:cs="Times New Roman"/>
+          <w:color w:val="000000"/>
+          <w:sz w:val="22"/>
+          <w:szCs w:val="22"/>
+        </w:rPr>
+        <w:t xml:space="preserve">•	</w:t>
+      </w:r>
+      <w:r>
+        <w:rPr>
+          <w:rFonts w:ascii="Times New Roman" w:hAnsi="Times New Roman" w:cs="Times New Roman"/>
+          <w:color w:val="000000"/>
+          <w:sz w:val="22"/>
+          <w:szCs w:val="22"/>
+        </w:rPr>
+        <w:t xml:space="preserve">README completo y commits incrementales.</w:t>
       </w:r>
     </w:p>
     <w:p>
@@ -938,7 +1084,7 @@
           <w:sz w:val="18"/>
           <w:szCs w:val="18"/>
         </w:rPr>
-        <w:t xml:space="preserve">  README.md   -&gt; problema, diseno, instrucciones, capturas</w:t>
+        <w:t xml:space="preserve">  README.md    -&gt; problema, diseño (clases/relaciones), instrucciones, capturas</w:t>
       </w:r>
     </w:p>
     <w:p>
@@ -954,7 +1100,7 @@
           <w:sz w:val="18"/>
           <w:szCs w:val="18"/>
         </w:rPr>
-        <w:t xml:space="preserve">  src/         -&gt; paquetes modelo/servicio/app</w:t>
+        <w:t xml:space="preserve">  src/</w:t>
       </w:r>
     </w:p>
     <w:p>
@@ -970,11 +1116,75 @@
           <w:sz w:val="18"/>
           <w:szCs w:val="18"/>
         </w:rPr>
-        <w:t xml:space="preserve">  data/        -&gt; archivo de persistencia (ej. .csv)</w:t>
+        <w:t xml:space="preserve">    modelo/       -&gt; entidades del dominio</w:t>
       </w:r>
     </w:p>
     <w:p>
       <w:pPr>
+        <w:spacing w:after="0" w:line="276" w:lineRule="auto"/>
+        <w:ind w:left="120"/>
+        <w:shd w:val="clear" w:color="auto" w:fill="F0F4F4"/>
+      </w:pPr>
+      <w:r>
+        <w:rPr>
+          <w:rFonts w:ascii="Consolas" w:hAnsi="Consolas" w:cs="Consolas"/>
+          <w:color w:val="2C3E50"/>
+          <w:sz w:val="18"/>
+          <w:szCs w:val="18"/>
+        </w:rPr>
+        <w:t xml:space="preserve">    servicio/     -&gt; logica de negocio (CRUD, reglas)</w:t>
+      </w:r>
+    </w:p>
+    <w:p>
+      <w:pPr>
+        <w:spacing w:after="0" w:line="276" w:lineRule="auto"/>
+        <w:ind w:left="120"/>
+        <w:shd w:val="clear" w:color="auto" w:fill="F0F4F4"/>
+      </w:pPr>
+      <w:r>
+        <w:rPr>
+          <w:rFonts w:ascii="Consolas" w:hAnsi="Consolas" w:cs="Consolas"/>
+          <w:color w:val="2C3E50"/>
+          <w:sz w:val="18"/>
+          <w:szCs w:val="18"/>
+        </w:rPr>
+        <w:t xml:space="preserve">    persistencia/ -&gt; repositorio (guardar/cargar)</w:t>
+      </w:r>
+    </w:p>
+    <w:p>
+      <w:pPr>
+        <w:spacing w:after="0" w:line="276" w:lineRule="auto"/>
+        <w:ind w:left="120"/>
+        <w:shd w:val="clear" w:color="auto" w:fill="F0F4F4"/>
+      </w:pPr>
+      <w:r>
+        <w:rPr>
+          <w:rFonts w:ascii="Consolas" w:hAnsi="Consolas" w:cs="Consolas"/>
+          <w:color w:val="2C3E50"/>
+          <w:sz w:val="18"/>
+          <w:szCs w:val="18"/>
+        </w:rPr>
+        <w:t xml:space="preserve">    app/          -&gt; Main (consola)</w:t>
+      </w:r>
+    </w:p>
+    <w:p>
+      <w:pPr>
+        <w:spacing w:after="0" w:line="276" w:lineRule="auto"/>
+        <w:ind w:left="120"/>
+        <w:shd w:val="clear" w:color="auto" w:fill="F0F4F4"/>
+      </w:pPr>
+      <w:r>
+        <w:rPr>
+          <w:rFonts w:ascii="Consolas" w:hAnsi="Consolas" w:cs="Consolas"/>
+          <w:color w:val="2C3E50"/>
+          <w:sz w:val="18"/>
+          <w:szCs w:val="18"/>
+        </w:rPr>
+        <w:t xml:space="preserve">  datos/         -&gt; archivos de datos (ej. datos.csv)</w:t>
+      </w:r>
+    </w:p>
+    <w:p>
+      <w:pPr>
         <w:spacing w:after="120" w:line="276" w:lineRule="auto"/>
         <w:ind w:left="454" w:hanging="284"/>
       </w:pPr>
@@ -994,7 +1204,7 @@
           <w:sz w:val="22"/>
           <w:szCs w:val="22"/>
         </w:rPr>
-        <w:t xml:space="preserve">Crea (o usa) el repo del proyecto.</w:t>
+        <w:t xml:space="preserve">Crea el repositorio público con ese nombre.</w:t>
       </w:r>
     </w:p>
     <w:p>
@@ -1018,7 +1228,7 @@
           <w:sz w:val="22"/>
           <w:szCs w:val="22"/>
         </w:rPr>
-        <w:t xml:space="preserve">Sube el proyecto con commits incrementales.</w:t>
+        <w:t xml:space="preserve">Sube el código organizado por capas y el README.</w:t>
       </w:r>
     </w:p>
     <w:p>
@@ -1042,7 +1252,31 @@
           <w:sz w:val="22"/>
           <w:szCs w:val="22"/>
         </w:rPr>
-        <w:t xml:space="preserve">Comparte el enlace por el canal indicado.</w:t>
+        <w:t xml:space="preserve">Realiza commits incrementales y claros durante el desarrollo.</w:t>
+      </w:r>
+    </w:p>
+    <w:p>
+      <w:pPr>
+        <w:spacing w:after="120" w:line="276" w:lineRule="auto"/>
+        <w:ind w:left="454" w:hanging="284"/>
+      </w:pPr>
+      <w:r>
+        <w:rPr>
+          <w:rFonts w:ascii="Times New Roman" w:hAnsi="Times New Roman" w:cs="Times New Roman"/>
+          <w:color w:val="000000"/>
+          <w:sz w:val="22"/>
+          <w:szCs w:val="22"/>
+        </w:rPr>
+        <w:t xml:space="preserve">4.	</w:t>
+      </w:r>
+      <w:r>
+        <w:rPr>
+          <w:rFonts w:ascii="Times New Roman" w:hAnsi="Times New Roman" w:cs="Times New Roman"/>
+          <w:color w:val="000000"/>
+          <w:sz w:val="22"/>
+          <w:szCs w:val="22"/>
+        </w:rPr>
+        <w:t xml:space="preserve">Comparte el enlace por el canal indicado por el docente.</w:t>
       </w:r>
     </w:p>
     <w:p>
@@ -1125,7 +1359,7 @@
                 <w:sz w:val="20"/>
                 <w:szCs w:val="20"/>
               </w:rPr>
-              <w:t xml:space="preserve">Excelente</w:t>
+              <w:t xml:space="preserve">Excelente (100%)</w:t>
             </w:r>
           </w:p>
         </w:tc>
@@ -1147,7 +1381,7 @@
                 <w:sz w:val="20"/>
                 <w:szCs w:val="20"/>
               </w:rPr>
-              <w:t xml:space="preserve">Aceptable</w:t>
+              <w:t xml:space="preserve">Aceptable (60%)</w:t>
             </w:r>
           </w:p>
         </w:tc>
@@ -1169,7 +1403,7 @@
                 <w:sz w:val="20"/>
                 <w:szCs w:val="20"/>
               </w:rPr>
-              <w:t xml:space="preserve">Por mejorar</w:t>
+              <w:t xml:space="preserve">Por mejorar (0%)</w:t>
             </w:r>
           </w:p>
         </w:tc>
@@ -1233,7 +1467,7 @@
                 <w:sz w:val="20"/>
                 <w:szCs w:val="20"/>
               </w:rPr>
-              <w:t xml:space="preserve">Todos correctos</w:t>
+              <w:t xml:space="preserve">Todos, correctos y justificados</w:t>
             </w:r>
           </w:p>
         </w:tc>
@@ -1293,7 +1527,7 @@
                 <w:sz w:val="20"/>
                 <w:szCs w:val="20"/>
               </w:rPr>
-              <w:t xml:space="preserve">30</w:t>
+              <w:t xml:space="preserve">25</w:t>
             </w:r>
           </w:p>
         </w:tc>
@@ -1315,27 +1549,27 @@
                 <w:sz w:val="20"/>
                 <w:szCs w:val="20"/>
               </w:rPr>
-              <w:t xml:space="preserve">Colecciones + excepciones + persistencia</w:t>
-            </w:r>
-          </w:p>
-        </w:tc>
-        <w:tc>
-          <w:tcPr>
-            <w:tcW w:w="0" w:type="auto"/>
-            <w:vAlign w:val="center"/>
-          </w:tcPr>
-          <w:p>
-            <w:pPr>
-              <w:spacing w:after="20" w:before="20"/>
-            </w:pPr>
-            <w:r>
-              <w:rPr>
-                <w:rFonts w:ascii="Times New Roman" w:hAnsi="Times New Roman" w:cs="Times New Roman"/>
-                <w:color w:val="000000"/>
-                <w:sz w:val="20"/>
-                <w:szCs w:val="20"/>
-              </w:rPr>
-              <w:t xml:space="preserve">Correctos</w:t>
+              <w:t xml:space="preserve">Colecciones + excepciones</w:t>
+            </w:r>
+          </w:p>
+        </w:tc>
+        <w:tc>
+          <w:tcPr>
+            <w:tcW w:w="0" w:type="auto"/>
+            <w:vAlign w:val="center"/>
+          </w:tcPr>
+          <w:p>
+            <w:pPr>
+              <w:spacing w:after="20" w:before="20"/>
+            </w:pPr>
+            <w:r>
+              <w:rPr>
+                <w:rFonts w:ascii="Times New Roman" w:hAnsi="Times New Roman" w:cs="Times New Roman"/>
+                <w:color w:val="000000"/>
+                <w:sz w:val="20"/>
+                <w:szCs w:val="20"/>
+              </w:rPr>
+              <w:t xml:space="preserve">Correctos y pertinentes</w:t>
             </w:r>
           </w:p>
         </w:tc>
@@ -1395,7 +1629,7 @@
                 <w:sz w:val="20"/>
                 <w:szCs w:val="20"/>
               </w:rPr>
-              <w:t xml:space="preserve">30</w:t>
+              <w:t xml:space="preserve">20</w:t>
             </w:r>
           </w:p>
         </w:tc>
@@ -1437,7 +1671,7 @@
                 <w:sz w:val="20"/>
                 <w:szCs w:val="20"/>
               </w:rPr>
-              <w:t xml:space="preserve">Completo</w:t>
+              <w:t xml:space="preserve">Completo y probado</w:t>
             </w:r>
           </w:p>
         </w:tc>
@@ -1519,27 +1753,129 @@
                 <w:sz w:val="20"/>
                 <w:szCs w:val="20"/>
               </w:rPr>
-              <w:t xml:space="preserve">Código limpio, README y commits</w:t>
-            </w:r>
-          </w:p>
-        </w:tc>
-        <w:tc>
-          <w:tcPr>
-            <w:tcW w:w="0" w:type="auto"/>
-            <w:vAlign w:val="center"/>
-          </w:tcPr>
-          <w:p>
-            <w:pPr>
-              <w:spacing w:after="20" w:before="20"/>
-            </w:pPr>
-            <w:r>
-              <w:rPr>
-                <w:rFonts w:ascii="Times New Roman" w:hAnsi="Times New Roman" w:cs="Times New Roman"/>
-                <w:color w:val="000000"/>
-                <w:sz w:val="20"/>
-                <w:szCs w:val="20"/>
-              </w:rPr>
-              <w:t xml:space="preserve">Ordenado</w:t>
+              <w:t xml:space="preserve">Persistencia (repositorio)</w:t>
+            </w:r>
+          </w:p>
+        </w:tc>
+        <w:tc>
+          <w:tcPr>
+            <w:tcW w:w="0" w:type="auto"/>
+            <w:vAlign w:val="center"/>
+          </w:tcPr>
+          <w:p>
+            <w:pPr>
+              <w:spacing w:after="20" w:before="20"/>
+            </w:pPr>
+            <w:r>
+              <w:rPr>
+                <w:rFonts w:ascii="Times New Roman" w:hAnsi="Times New Roman" w:cs="Times New Roman"/>
+                <w:color w:val="000000"/>
+                <w:sz w:val="20"/>
+                <w:szCs w:val="20"/>
+              </w:rPr>
+              <w:t xml:space="preserve">Funciona y está separada</w:t>
+            </w:r>
+          </w:p>
+        </w:tc>
+        <w:tc>
+          <w:tcPr>
+            <w:tcW w:w="0" w:type="auto"/>
+            <w:vAlign w:val="center"/>
+          </w:tcPr>
+          <w:p>
+            <w:pPr>
+              <w:spacing w:after="20" w:before="20"/>
+            </w:pPr>
+            <w:r>
+              <w:rPr>
+                <w:rFonts w:ascii="Times New Roman" w:hAnsi="Times New Roman" w:cs="Times New Roman"/>
+                <w:color w:val="000000"/>
+                <w:sz w:val="20"/>
+                <w:szCs w:val="20"/>
+              </w:rPr>
+              <w:t xml:space="preserve">Parcial</w:t>
+            </w:r>
+          </w:p>
+        </w:tc>
+        <w:tc>
+          <w:tcPr>
+            <w:tcW w:w="0" w:type="auto"/>
+            <w:vAlign w:val="center"/>
+          </w:tcPr>
+          <w:p>
+            <w:pPr>
+              <w:spacing w:after="20" w:before="20"/>
+            </w:pPr>
+            <w:r>
+              <w:rPr>
+                <w:rFonts w:ascii="Times New Roman" w:hAnsi="Times New Roman" w:cs="Times New Roman"/>
+                <w:color w:val="000000"/>
+                <w:sz w:val="20"/>
+                <w:szCs w:val="20"/>
+              </w:rPr>
+              <w:t xml:space="preserve">Ausente</w:t>
+            </w:r>
+          </w:p>
+        </w:tc>
+        <w:tc>
+          <w:tcPr>
+            <w:tcW w:w="0" w:type="auto"/>
+            <w:vAlign w:val="center"/>
+          </w:tcPr>
+          <w:p>
+            <w:pPr>
+              <w:spacing w:after="20" w:before="20"/>
+            </w:pPr>
+            <w:r>
+              <w:rPr>
+                <w:rFonts w:ascii="Times New Roman" w:hAnsi="Times New Roman" w:cs="Times New Roman"/>
+                <w:color w:val="000000"/>
+                <w:sz w:val="20"/>
+                <w:szCs w:val="20"/>
+              </w:rPr>
+              <w:t xml:space="preserve">15</w:t>
+            </w:r>
+          </w:p>
+        </w:tc>
+      </w:tr>
+      <w:tr>
+        <w:tc>
+          <w:tcPr>
+            <w:tcW w:w="0" w:type="auto"/>
+            <w:vAlign w:val="center"/>
+          </w:tcPr>
+          <w:p>
+            <w:pPr>
+              <w:spacing w:after="20" w:before="20"/>
+            </w:pPr>
+            <w:r>
+              <w:rPr>
+                <w:rFonts w:ascii="Times New Roman" w:hAnsi="Times New Roman" w:cs="Times New Roman"/>
+                <w:color w:val="000000"/>
+                <w:sz w:val="20"/>
+                <w:szCs w:val="20"/>
+              </w:rPr>
+              <w:t xml:space="preserve">Diseño (capas, cohesión/acoplamiento)</w:t>
+            </w:r>
+          </w:p>
+        </w:tc>
+        <w:tc>
+          <w:tcPr>
+            <w:tcW w:w="0" w:type="auto"/>
+            <w:vAlign w:val="center"/>
+          </w:tcPr>
+          <w:p>
+            <w:pPr>
+              <w:spacing w:after="20" w:before="20"/>
+            </w:pPr>
+            <w:r>
+              <w:rPr>
+                <w:rFonts w:ascii="Times New Roman" w:hAnsi="Times New Roman" w:cs="Times New Roman"/>
+                <w:color w:val="000000"/>
+                <w:sz w:val="20"/>
+                <w:szCs w:val="20"/>
+              </w:rPr>
+              <w:t xml:space="preserve">Claro y justificado</w:t>
             </w:r>
           </w:p>
         </w:tc>
@@ -1579,6 +1915,108 @@
                 <w:sz w:val="20"/>
                 <w:szCs w:val="20"/>
               </w:rPr>
+              <w:t xml:space="preserve">Débil</w:t>
+            </w:r>
+          </w:p>
+        </w:tc>
+        <w:tc>
+          <w:tcPr>
+            <w:tcW w:w="0" w:type="auto"/>
+            <w:vAlign w:val="center"/>
+          </w:tcPr>
+          <w:p>
+            <w:pPr>
+              <w:spacing w:after="20" w:before="20"/>
+            </w:pPr>
+            <w:r>
+              <w:rPr>
+                <w:rFonts w:ascii="Times New Roman" w:hAnsi="Times New Roman" w:cs="Times New Roman"/>
+                <w:color w:val="000000"/>
+                <w:sz w:val="20"/>
+                <w:szCs w:val="20"/>
+              </w:rPr>
+              <w:t xml:space="preserve">10</w:t>
+            </w:r>
+          </w:p>
+        </w:tc>
+      </w:tr>
+      <w:tr>
+        <w:tc>
+          <w:tcPr>
+            <w:tcW w:w="0" w:type="auto"/>
+            <w:vAlign w:val="center"/>
+          </w:tcPr>
+          <w:p>
+            <w:pPr>
+              <w:spacing w:after="20" w:before="20"/>
+            </w:pPr>
+            <w:r>
+              <w:rPr>
+                <w:rFonts w:ascii="Times New Roman" w:hAnsi="Times New Roman" w:cs="Times New Roman"/>
+                <w:color w:val="000000"/>
+                <w:sz w:val="20"/>
+                <w:szCs w:val="20"/>
+              </w:rPr>
+              <w:t xml:space="preserve">README + commits</w:t>
+            </w:r>
+          </w:p>
+        </w:tc>
+        <w:tc>
+          <w:tcPr>
+            <w:tcW w:w="0" w:type="auto"/>
+            <w:vAlign w:val="center"/>
+          </w:tcPr>
+          <w:p>
+            <w:pPr>
+              <w:spacing w:after="20" w:before="20"/>
+            </w:pPr>
+            <w:r>
+              <w:rPr>
+                <w:rFonts w:ascii="Times New Roman" w:hAnsi="Times New Roman" w:cs="Times New Roman"/>
+                <w:color w:val="000000"/>
+                <w:sz w:val="20"/>
+                <w:szCs w:val="20"/>
+              </w:rPr>
+              <w:t xml:space="preserve">Ordenado e incremental</w:t>
+            </w:r>
+          </w:p>
+        </w:tc>
+        <w:tc>
+          <w:tcPr>
+            <w:tcW w:w="0" w:type="auto"/>
+            <w:vAlign w:val="center"/>
+          </w:tcPr>
+          <w:p>
+            <w:pPr>
+              <w:spacing w:after="20" w:before="20"/>
+            </w:pPr>
+            <w:r>
+              <w:rPr>
+                <w:rFonts w:ascii="Times New Roman" w:hAnsi="Times New Roman" w:cs="Times New Roman"/>
+                <w:color w:val="000000"/>
+                <w:sz w:val="20"/>
+                <w:szCs w:val="20"/>
+              </w:rPr>
+              <w:t xml:space="preserve">Aceptable</w:t>
+            </w:r>
+          </w:p>
+        </w:tc>
+        <w:tc>
+          <w:tcPr>
+            <w:tcW w:w="0" w:type="auto"/>
+            <w:vAlign w:val="center"/>
+          </w:tcPr>
+          <w:p>
+            <w:pPr>
+              <w:spacing w:after="20" w:before="20"/>
+            </w:pPr>
+            <w:r>
+              <w:rPr>
+                <w:rFonts w:ascii="Times New Roman" w:hAnsi="Times New Roman" w:cs="Times New Roman"/>
+                <w:color w:val="000000"/>
+                <w:sz w:val="20"/>
+                <w:szCs w:val="20"/>
+              </w:rPr>
               <w:t xml:space="preserve">Deficiente</w:t>
             </w:r>
           </w:p>
@@ -1599,7 +2037,7 @@
                 <w:sz w:val="20"/>
                 <w:szCs w:val="20"/>
               </w:rPr>
-              <w:t xml:space="preserve">20</w:t>
+              <w:t xml:space="preserve">10</w:t>
             </w:r>
           </w:p>
         </w:tc>
@@ -1618,7 +2056,42 @@
           <w:sz w:val="21"/>
           <w:szCs w:val="21"/>
         </w:rPr>
-        <w:t xml:space="preserve">Nota: actividad formativa y opcional (sin nota en Moodle). La guía unificada de entrega estará en el Manual de Entrega de Actividades Opcionales (próximamente).</w:t>
+        <w:t xml:space="preserve">tip: Antes de entregar, </w:t>
+      </w:r>
+      <w:r>
+        <w:rPr>
+          <w:rFonts w:ascii="Times New Roman" w:hAnsi="Times New Roman" w:cs="Times New Roman"/>
+          <w:b/>
+          <w:color w:val="000000"/>
+          <w:sz w:val="21"/>
+          <w:szCs w:val="21"/>
+        </w:rPr>
+        <w:t xml:space="preserve">autoevalúate con esta rúbrica</w:t>
+      </w:r>
+      <w:r>
+        <w:rPr>
+          <w:rFonts w:ascii="Times New Roman" w:hAnsi="Times New Roman" w:cs="Times New Roman"/>
+          <w:color w:val="000000"/>
+          <w:sz w:val="21"/>
+          <w:szCs w:val="21"/>
+        </w:rPr>
+        <w:t xml:space="preserve">. Cualquier criterio flojo aún puedes reforzarlo. Un buen README y commits claros comunican profesionalismo.</w:t>
+      </w:r>
+    </w:p>
+    <w:p>
+      <w:pPr>
+        <w:spacing w:before="120" w:after="120" w:line="276" w:lineRule="auto"/>
+        <w:ind w:left="120"/>
+        <w:shd w:val="clear" w:color="auto" w:fill="E9F7EF"/>
+      </w:pPr>
+      <w:r>
+        <w:rPr>
+          <w:rFonts w:ascii="Times New Roman" w:hAnsi="Times New Roman" w:cs="Times New Roman"/>
+          <w:color w:val="000000"/>
+          <w:sz w:val="21"/>
+          <w:szCs w:val="21"/>
+        </w:rPr>
+        <w:t xml:space="preserve">Nota: actividad formativa y opcional (sin nota en Moodle). La guía unificada para entregar todas las actividades opcionales, válida para todas las materias, estará en el Manual de Entrega de Actividades Opcionales (próximamente).</w:t>
       </w:r>
     </w:p>
     <w:sectPr>

</xml_diff>